<commit_message>
fix: corrigir formatacao do relatorio
</commit_message>
<xml_diff>
--- a/reports/relatorio_executivo.docx
+++ b/reports/relatorio_executivo.docx
@@ -721,7 +721,7 @@
         <w:widowControl w:val="0"/>
         <w:spacing w:line="360" w:lineRule="auto"/>
         <w:ind w:left="4535.433070866142" w:right="28.155517578125" w:firstLine="0"/>
-        <w:jc w:val="center"/>
+        <w:jc w:val="both"/>
         <w:rPr>
           <w:sz w:val="24"/>
           <w:szCs w:val="24"/>
@@ -759,7 +759,7 @@
         <w:widowControl w:val="0"/>
         <w:spacing w:line="360" w:lineRule="auto"/>
         <w:ind w:left="4535.433070866142" w:right="28.155517578125" w:firstLine="0"/>
-        <w:jc w:val="center"/>
+        <w:jc w:val="both"/>
         <w:rPr>
           <w:b w:val="1"/>
           <w:bCs w:val="1"/>
@@ -3270,7 +3270,7 @@
           <w:rFonts w:ascii="Arial" w:hAnsi="Arial"/>
           <w:sz w:val="24"/>
         </w:rPr>
-        <w:t xml:space="preserve"> reproduz toda a análise e este relatório a partir do arquivo original. O repositório está em https://github.com/SEU-USUARIO/sisb110-ibm-hr-analytics.</w:t>
+        <w:t xml:space="preserve"> reproduz toda a análise e este relatório a partir do arquivo original. O repositório está em https://github.com/josefideles/sisb110-ibm-hr-analytics.</w:t>
       </w:r>
     </w:p>
     <w:p>
@@ -13744,7 +13744,7 @@
           <w:b/>
           <w:sz w:val="24"/>
         </w:rPr>
-        <w:t>https://github.com/SEU-USUARIO/sisb110-ibm-hr-analytics</w:t>
+        <w:t>https://github.com/josefideles/sisb110-ibm-hr-analytics</w:t>
       </w:r>
       <w:r>
         <w:rPr>

</xml_diff>